<commit_message>
fix course name and assistant name in title page
</commit_message>
<xml_diff>
--- a/lab1/Report_Lab1_Caesar_Cipher.docx
+++ b/lab1/Report_Lab1_Caesar_Cipher.docx
@@ -406,7 +406,6 @@
           <w:color w:val="000000"/>
           <w:sz w:val="40"/>
           <w:szCs w:val="40"/>
-          <w:lang w:val="en-GB"/>
         </w:rPr>
       </w:pPr>
       <w:r>
@@ -419,7 +418,7 @@
           <w:szCs w:val="40"/>
           <w:lang w:val="en-GB"/>
         </w:rPr>
-        <w:t>Computer Architecture</w:t>
+        <w:t>Cryptography and Security</w:t>
       </w:r>
     </w:p>
     <w:p>
@@ -588,8 +587,10 @@
           <w:szCs w:val="28"/>
           <w:lang w:val="en-GB" w:bidi="th-TH"/>
         </w:rPr>
-        <w:t>Olga Grosu</w:t>
-      </w:r>
+        <w:t>Maia Zaica</w:t>
+      </w:r>
+      <w:bookmarkStart w:id="0" w:name="_GoBack"/>
+      <w:bookmarkEnd w:id="0"/>
       <w:r>
         <w:rPr>
           <w:b/>
@@ -1451,22 +1452,22 @@
         <w:pStyle w:val="1"/>
         <w:pageBreakBefore/>
       </w:pPr>
-      <w:bookmarkStart w:id="0" w:name="_Toc900001"/>
+      <w:bookmarkStart w:id="1" w:name="_Toc900001"/>
       <w:r>
         <w:lastRenderedPageBreak/>
         <w:t>1 AIM OF THE WORK</w:t>
       </w:r>
-      <w:bookmarkEnd w:id="0"/>
+      <w:bookmarkEnd w:id="1"/>
     </w:p>
     <w:p>
       <w:pPr>
         <w:pStyle w:val="2"/>
       </w:pPr>
-      <w:bookmarkStart w:id="1" w:name="_Toc900002"/>
+      <w:bookmarkStart w:id="2" w:name="_Toc900002"/>
       <w:r>
         <w:t>1.1 Purpose of laboratory work</w:t>
       </w:r>
-      <w:bookmarkEnd w:id="1"/>
+      <w:bookmarkEnd w:id="2"/>
     </w:p>
     <w:p>
       <w:pPr>
@@ -1528,11 +1529,11 @@
       <w:pPr>
         <w:pStyle w:val="2"/>
       </w:pPr>
-      <w:bookmarkStart w:id="2" w:name="_Toc900003"/>
+      <w:bookmarkStart w:id="3" w:name="_Toc900003"/>
       <w:r>
         <w:t>1.2 Problem statement</w:t>
       </w:r>
-      <w:bookmarkEnd w:id="2"/>
+      <w:bookmarkEnd w:id="3"/>
     </w:p>
     <w:p>
       <w:pPr>
@@ -1595,22 +1596,22 @@
         <w:pStyle w:val="1"/>
         <w:pageBreakBefore/>
       </w:pPr>
-      <w:bookmarkStart w:id="3" w:name="_Toc900004"/>
+      <w:bookmarkStart w:id="4" w:name="_Toc900004"/>
       <w:r>
         <w:lastRenderedPageBreak/>
         <w:t>2 THEORETICAL BACKGROUND</w:t>
       </w:r>
-      <w:bookmarkEnd w:id="3"/>
+      <w:bookmarkEnd w:id="4"/>
     </w:p>
     <w:p>
       <w:pPr>
         <w:pStyle w:val="2"/>
       </w:pPr>
-      <w:bookmarkStart w:id="4" w:name="_Toc900005"/>
+      <w:bookmarkStart w:id="5" w:name="_Toc900005"/>
       <w:r>
         <w:t>2.1 Caesar cipher</w:t>
       </w:r>
-      <w:bookmarkEnd w:id="4"/>
+      <w:bookmarkEnd w:id="5"/>
     </w:p>
     <w:p>
       <w:pPr>
@@ -2056,11 +2057,11 @@
       <w:pPr>
         <w:pStyle w:val="2"/>
       </w:pPr>
-      <w:bookmarkStart w:id="5" w:name="_Toc900006"/>
+      <w:bookmarkStart w:id="6" w:name="_Toc900006"/>
       <w:r>
         <w:t>2.2 Caesar cipher with a permutation</w:t>
       </w:r>
-      <w:bookmarkEnd w:id="5"/>
+      <w:bookmarkEnd w:id="6"/>
     </w:p>
     <w:p>
       <w:pPr>
@@ -2160,11 +2161,11 @@
       <w:pPr>
         <w:pStyle w:val="2"/>
       </w:pPr>
-      <w:bookmarkStart w:id="6" w:name="_Toc900007"/>
+      <w:bookmarkStart w:id="7" w:name="_Toc900007"/>
       <w:r>
         <w:t>2.3 Key space and cryptanalysis</w:t>
       </w:r>
-      <w:bookmarkEnd w:id="6"/>
+      <w:bookmarkEnd w:id="7"/>
     </w:p>
     <w:p>
       <w:pPr>
@@ -2803,22 +2804,22 @@
         <w:pStyle w:val="1"/>
         <w:pageBreakBefore/>
       </w:pPr>
-      <w:bookmarkStart w:id="7" w:name="_Toc900008"/>
+      <w:bookmarkStart w:id="8" w:name="_Toc900008"/>
       <w:r>
         <w:lastRenderedPageBreak/>
         <w:t>3 IMPLEMENTATION</w:t>
       </w:r>
-      <w:bookmarkEnd w:id="7"/>
+      <w:bookmarkEnd w:id="8"/>
     </w:p>
     <w:p>
       <w:pPr>
         <w:pStyle w:val="2"/>
       </w:pPr>
-      <w:bookmarkStart w:id="8" w:name="_Toc900009"/>
+      <w:bookmarkStart w:id="9" w:name="_Toc900009"/>
       <w:r>
         <w:t>3.1 Structure of the programs</w:t>
       </w:r>
-      <w:bookmarkEnd w:id="8"/>
+      <w:bookmarkEnd w:id="9"/>
     </w:p>
     <w:p>
       <w:pPr>
@@ -3330,11 +3331,11 @@
       <w:pPr>
         <w:pStyle w:val="2"/>
       </w:pPr>
-      <w:bookmarkStart w:id="9" w:name="_Toc900010"/>
+      <w:bookmarkStart w:id="10" w:name="_Toc900010"/>
       <w:r>
         <w:t>3.2 Letter encoding</w:t>
       </w:r>
-      <w:bookmarkEnd w:id="9"/>
+      <w:bookmarkEnd w:id="10"/>
     </w:p>
     <w:p>
       <w:pPr>
@@ -4543,11 +4544,11 @@
       <w:pPr>
         <w:pStyle w:val="2"/>
       </w:pPr>
-      <w:bookmarkStart w:id="10" w:name="_Toc900011"/>
+      <w:bookmarkStart w:id="11" w:name="_Toc900011"/>
       <w:r>
         <w:t>3.3 Normalization of the text</w:t>
       </w:r>
-      <w:bookmarkEnd w:id="10"/>
+      <w:bookmarkEnd w:id="11"/>
     </w:p>
     <w:p>
       <w:pPr>
@@ -4909,12 +4910,12 @@
       <w:pPr>
         <w:pStyle w:val="2"/>
       </w:pPr>
-      <w:bookmarkStart w:id="11" w:name="_Toc900012"/>
+      <w:bookmarkStart w:id="12" w:name="_Toc900012"/>
       <w:r>
         <w:lastRenderedPageBreak/>
         <w:t>3.4 Input and validation</w:t>
       </w:r>
-      <w:bookmarkEnd w:id="11"/>
+      <w:bookmarkEnd w:id="12"/>
     </w:p>
     <w:p>
       <w:pPr>
@@ -5675,11 +5676,11 @@
       <w:pPr>
         <w:pStyle w:val="2"/>
       </w:pPr>
-      <w:bookmarkStart w:id="12" w:name="_Toc900013"/>
+      <w:bookmarkStart w:id="13" w:name="_Toc900013"/>
       <w:r>
         <w:t>3.5 Permuted alphabet, encryption and decryption</w:t>
       </w:r>
-      <w:bookmarkEnd w:id="12"/>
+      <w:bookmarkEnd w:id="13"/>
     </w:p>
     <w:p>
       <w:pPr>
@@ -5979,11 +5980,11 @@
       <w:pPr>
         <w:pStyle w:val="2"/>
       </w:pPr>
-      <w:bookmarkStart w:id="13" w:name="_Toc900014"/>
+      <w:bookmarkStart w:id="14" w:name="_Toc900014"/>
       <w:r>
         <w:t>3.6 Main functions</w:t>
       </w:r>
-      <w:bookmarkEnd w:id="13"/>
+      <w:bookmarkEnd w:id="14"/>
     </w:p>
     <w:p>
       <w:pPr>
@@ -6265,22 +6266,22 @@
         <w:pStyle w:val="1"/>
         <w:pageBreakBefore/>
       </w:pPr>
-      <w:bookmarkStart w:id="14" w:name="_Toc900015"/>
+      <w:bookmarkStart w:id="15" w:name="_Toc900015"/>
       <w:r>
         <w:lastRenderedPageBreak/>
         <w:t>4 RESULTS</w:t>
       </w:r>
-      <w:bookmarkEnd w:id="14"/>
+      <w:bookmarkEnd w:id="15"/>
     </w:p>
     <w:p>
       <w:pPr>
         <w:pStyle w:val="2"/>
       </w:pPr>
-      <w:bookmarkStart w:id="15" w:name="_Toc900016"/>
+      <w:bookmarkStart w:id="16" w:name="_Toc900016"/>
       <w:r>
         <w:t>4.1 Task 1.1: Caesar cipher</w:t>
       </w:r>
-      <w:bookmarkEnd w:id="15"/>
+      <w:bookmarkEnd w:id="16"/>
     </w:p>
     <w:p>
       <w:pPr>
@@ -6559,11 +6560,11 @@
       <w:pPr>
         <w:pStyle w:val="2"/>
       </w:pPr>
-      <w:bookmarkStart w:id="16" w:name="_Toc900017"/>
+      <w:bookmarkStart w:id="17" w:name="_Toc900017"/>
       <w:r>
         <w:t>4.2 Task 1.2: Caesar cipher with two keys</w:t>
       </w:r>
-      <w:bookmarkEnd w:id="16"/>
+      <w:bookmarkEnd w:id="17"/>
     </w:p>
     <w:p>
       <w:pPr>
@@ -6774,11 +6775,11 @@
       <w:pPr>
         <w:pStyle w:val="2"/>
       </w:pPr>
-      <w:bookmarkStart w:id="17" w:name="_Toc900018"/>
+      <w:bookmarkStart w:id="18" w:name="_Toc900018"/>
       <w:r>
         <w:t>4.3 Verification of the results</w:t>
       </w:r>
-      <w:bookmarkEnd w:id="17"/>
+      <w:bookmarkEnd w:id="18"/>
     </w:p>
     <w:p>
       <w:pPr>
@@ -7775,12 +7776,12 @@
         <w:pStyle w:val="1"/>
         <w:pageBreakBefore/>
       </w:pPr>
-      <w:bookmarkStart w:id="18" w:name="_Toc900019"/>
+      <w:bookmarkStart w:id="19" w:name="_Toc900019"/>
       <w:r>
         <w:lastRenderedPageBreak/>
         <w:t>CONCLUSIONS</w:t>
       </w:r>
-      <w:bookmarkEnd w:id="18"/>
+      <w:bookmarkEnd w:id="19"/>
     </w:p>
     <w:p>
       <w:pPr>
@@ -7820,12 +7821,12 @@
         <w:pStyle w:val="1"/>
         <w:pageBreakBefore/>
       </w:pPr>
-      <w:bookmarkStart w:id="19" w:name="_Toc900020"/>
+      <w:bookmarkStart w:id="20" w:name="_Toc900020"/>
       <w:r>
         <w:lastRenderedPageBreak/>
         <w:t>SOURCE CODE</w:t>
       </w:r>
-      <w:bookmarkEnd w:id="19"/>
+      <w:bookmarkEnd w:id="20"/>
     </w:p>
     <w:p>
       <w:pPr>
@@ -7843,12 +7844,12 @@
         <w:pStyle w:val="1"/>
         <w:pageBreakBefore/>
       </w:pPr>
-      <w:bookmarkStart w:id="20" w:name="_Toc900021"/>
+      <w:bookmarkStart w:id="21" w:name="_Toc900021"/>
       <w:r>
         <w:lastRenderedPageBreak/>
         <w:t>REFERENCES</w:t>
       </w:r>
-      <w:bookmarkEnd w:id="20"/>
+      <w:bookmarkEnd w:id="21"/>
     </w:p>
     <w:p>
       <w:pPr>
@@ -7908,8 +7909,6 @@
       <w:r>
         <w:t>https://github.com/Makday/CS_labs</w:t>
       </w:r>
-      <w:bookmarkStart w:id="21" w:name="_GoBack"/>
-      <w:bookmarkEnd w:id="21"/>
     </w:p>
     <w:sectPr>
       <w:footerReference w:type="default" r:id="rId15"/>
@@ -7972,7 +7971,7 @@
           <w:rPr>
             <w:noProof/>
           </w:rPr>
-          <w:t>15</w:t>
+          <w:t>18</w:t>
         </w:r>
         <w:r>
           <w:fldChar w:fldCharType="end"/>
@@ -9225,7 +9224,7 @@
 </file>
 
 <file path=customXml/itemProps1.xml><?xml version="1.0" encoding="utf-8"?>
-<ds:datastoreItem xmlns:ds="http://schemas.openxmlformats.org/officeDocument/2006/customXml" ds:itemID="{8A45C57B-C139-4E64-87A6-1ECAE7C4E201}">
+<ds:datastoreItem xmlns:ds="http://schemas.openxmlformats.org/officeDocument/2006/customXml" ds:itemID="{5DE6B58E-A8B8-406F-BE90-10D4FDEAA397}">
   <ds:schemaRefs>
     <ds:schemaRef ds:uri="http://schemas.openxmlformats.org/officeDocument/2006/bibliography"/>
   </ds:schemaRefs>

</xml_diff>